<commit_message>
[lightbox] 1) lighthouse: removed china react variation 2) default variation now lights china via beam colors + white-only strobe (superimposed, not overwritten) 3) widened beam cones so 2 megabars always guaranteed lit per side 4) enforced min beam separation so overlap can't steal a beam's guaranteed coverage 5) guaranteed-core brightness now tapers smoothly instead of flat, with a floor 6) megabar exact-tie winner now alternates by index 7) saturation walk range 70-100%, starts 80% 8) synced README/visualizer docs, JS mirror, cheat sheet, wasm tests
</commit_message>
<xml_diff>
--- a/CarpetLightCode/cheat_sheet_card.docx
+++ b/CarpetLightCode/cheat_sheet_card.docx
@@ -618,7 +618,7 @@
                 <w:b/>
                 <w:sz w:val="20"/>
               </w:rPr>
-              <w:t>5 Lighthouse (3 var)</w:t>
+              <w:t>5 Lighthouse (2 var)</w:t>
             </w:r>
           </w:p>
           <w:p>
@@ -643,18 +643,6 @@
                 <w:sz w:val="20"/>
               </w:rPr>
               <w:t>▸ no strobe</w:t>
-            </w:r>
-          </w:p>
-          <w:p>
-            <w:pPr>
-              <w:spacing w:after="0" w:before="0"/>
-            </w:pPr>
-            <w:r>
-              <w:rPr>
-                <w:rFonts w:ascii="Arial" w:hAnsi="Arial"/>
-                <w:sz w:val="20"/>
-              </w:rPr>
-              <w:t>▸ china react</w:t>
             </w:r>
           </w:p>
           <w:p>
@@ -1144,7 +1132,7 @@
         <w:rPr>
           <w:sz w:val="12"/>
         </w:rPr>
-        <w:t>Generated 2026-08-16 11:27 PM PDT (Pacific) by tools/gen_cheat_sheet_card.py -- see cheat_sheet_card.txt for full print-prep steps and the Claude Code regeneration prompts.</w:t>
+        <w:t>Generated 2026-08-25 07:08 PM PDT (Pacific) by tools/gen_cheat_sheet_card.py -- see cheat_sheet_card.txt for full print-prep steps and the Claude Code regeneration prompts.</w:t>
       </w:r>
     </w:p>
     <w:sectPr>

</xml_diff>

<commit_message>
[lightbox] 1) deleted flame's shifting-hues and hue-to-white variations, and all their now-dead hue-drift machinery 2) speedstripes now boots to zebra by default 3) synced README/visualizer docs, cheat sheet, wasm tests, and a couple of stale cross-show comments
</commit_message>
<xml_diff>
--- a/CarpetLightCode/cheat_sheet_card.docx
+++ b/CarpetLightCode/cheat_sheet_card.docx
@@ -303,7 +303,7 @@
                 <w:b/>
                 <w:sz w:val="20"/>
               </w:rPr>
-              <w:t>2 Flame (4 var)</w:t>
+              <w:t>2 Flame (2 var)</w:t>
             </w:r>
           </w:p>
           <w:p>
@@ -339,30 +339,6 @@
                 <w:rFonts w:ascii="Arial" w:hAnsi="Arial"/>
                 <w:sz w:val="20"/>
               </w:rPr>
-              <w:t>▸ shifting hues</w:t>
-            </w:r>
-          </w:p>
-          <w:p>
-            <w:pPr>
-              <w:spacing w:after="0" w:before="0"/>
-            </w:pPr>
-            <w:r>
-              <w:rPr>
-                <w:rFonts w:ascii="Arial" w:hAnsi="Arial"/>
-                <w:sz w:val="20"/>
-              </w:rPr>
-              <w:t>▸ hue to white</w:t>
-            </w:r>
-          </w:p>
-          <w:p>
-            <w:pPr>
-              <w:spacing w:after="0" w:before="0"/>
-            </w:pPr>
-            <w:r>
-              <w:rPr>
-                <w:rFonts w:ascii="Arial" w:hAnsi="Arial"/>
-                <w:sz w:val="20"/>
-              </w:rPr>
               <w:t>All: Pot = energy</w:t>
             </w:r>
           </w:p>
@@ -375,19 +351,7 @@
                 <w:rFonts w:ascii="Arial" w:hAnsi="Arial"/>
                 <w:sz w:val="20"/>
               </w:rPr>
-              <w:t xml:space="preserve">  (fire-sim speed +</w:t>
-            </w:r>
-          </w:p>
-          <w:p>
-            <w:pPr>
-              <w:spacing w:after="0" w:before="0"/>
-            </w:pPr>
-            <w:r>
-              <w:rPr>
-                <w:rFonts w:ascii="Arial" w:hAnsi="Arial"/>
-                <w:sz w:val="20"/>
-              </w:rPr>
-              <w:t xml:space="preserve">  hue-drift rate)</w:t>
+              <w:t xml:space="preserve">  (fire-sim speed)</w:t>
             </w:r>
           </w:p>
         </w:tc>
@@ -412,19 +376,7 @@
                 <w:b/>
                 <w:sz w:val="20"/>
               </w:rPr>
-              <w:t>3 Equalizer (5 var)</w:t>
-            </w:r>
-          </w:p>
-          <w:p>
-            <w:pPr>
-              <w:spacing w:after="0" w:before="0"/>
-            </w:pPr>
-            <w:r>
-              <w:rPr>
-                <w:rFonts w:ascii="Arial" w:hAnsi="Arial"/>
-                <w:sz w:val="20"/>
-              </w:rPr>
-              <w:t>▸ chase</w:t>
+              <w:t>3 Equalizer (3 var)</w:t>
             </w:r>
           </w:p>
           <w:p>
@@ -437,18 +389,6 @@
                 <w:sz w:val="20"/>
               </w:rPr>
               <w:t>▸ VU meter</w:t>
-            </w:r>
-          </w:p>
-          <w:p>
-            <w:pPr>
-              <w:spacing w:after="0" w:before="0"/>
-            </w:pPr>
-            <w:r>
-              <w:rPr>
-                <w:rFonts w:ascii="Arial" w:hAnsi="Arial"/>
-                <w:sz w:val="20"/>
-              </w:rPr>
-              <w:t>▸ sub_standard</w:t>
             </w:r>
           </w:p>
           <w:p>
@@ -1132,7 +1072,7 @@
         <w:rPr>
           <w:sz w:val="12"/>
         </w:rPr>
-        <w:t>Generated 2026-08-25 07:08 PM PDT (Pacific) by tools/gen_cheat_sheet_card.py -- see cheat_sheet_card.txt for full print-prep steps and the Claude Code regeneration prompts.</w:t>
+        <w:t>Generated 2026-08-26 03:15 AM PDT (Pacific) by tools/gen_cheat_sheet_card.py -- see cheat_sheet_card.txt for full print-prep steps and the Claude Code regeneration prompts.</w:t>
       </w:r>
     </w:p>
     <w:sectPr>

</xml_diff>

<commit_message>
[lightbox] 1) fix cheat sheet: Audio subsetting count 7->6 (HitPredict rides Foresight's screen), AutoPk on/off->3-way Off/Full/Bin cycle 2) add README "Light show order"/"Config menu structure" sections with full pot/encoder contextual detail 3) add standalone one-page lightshow_config_reference.txt/.docx (+ generator script) 4) visualizer: fix trackpad pinch-zoom (was silently dropped by the left-click-hold zoom guard) 5) visualizer 3D: add "always render fixtures" setting (default off, gates car/wheel/flood-housing models to near-side-on pitch, light cones always draw) 6) visualizer 3D floor: replace scrolling noise texture with a static checkerboard 7) fix stale docs (pinch-zoom wording, a footer claiming 3D was "planned as a follow-up")
</commit_message>
<xml_diff>
--- a/CarpetLightCode/cheat_sheet_card.docx
+++ b/CarpetLightCode/cheat_sheet_card.docx
@@ -842,7 +842,7 @@
                 <w:b/>
                 <w:sz w:val="20"/>
               </w:rPr>
-              <w:t>② Audio (7 sub, in order)</w:t>
+              <w:t>② Audio (6 sub, in order)</w:t>
             </w:r>
           </w:p>
           <w:p>
@@ -890,7 +890,7 @@
                 <w:rFonts w:ascii="Arial" w:hAnsi="Arial"/>
                 <w:sz w:val="20"/>
               </w:rPr>
-              <w:t>HitPredict 0-Foresight</w:t>
+              <w:t>Foresight  0-1000ms</w:t>
             </w:r>
           </w:p>
           <w:p>
@@ -902,7 +902,7 @@
                 <w:rFonts w:ascii="Arial" w:hAnsi="Arial"/>
                 <w:sz w:val="20"/>
               </w:rPr>
-              <w:t xml:space="preserve">  Enc: style (off/exp/</w:t>
+              <w:t xml:space="preserve">  +HitPredict style</w:t>
             </w:r>
           </w:p>
           <w:p>
@@ -914,7 +914,7 @@
                 <w:rFonts w:ascii="Arial" w:hAnsi="Arial"/>
                 <w:sz w:val="20"/>
               </w:rPr>
-              <w:t xml:space="preserve">  machine-gun/drum)</w:t>
+              <w:t xml:space="preserve">  (off/exp/mg/drum,</w:t>
             </w:r>
           </w:p>
           <w:p>
@@ -926,7 +926,7 @@
                 <w:rFonts w:ascii="Arial" w:hAnsi="Arial"/>
                 <w:sz w:val="20"/>
               </w:rPr>
-              <w:t>Foresight  0-1000ms</w:t>
+              <w:t xml:space="preserve">  rides same screen)</w:t>
             </w:r>
           </w:p>
         </w:tc>
@@ -999,7 +999,19 @@
                 <w:rFonts w:ascii="Arial" w:hAnsi="Arial"/>
                 <w:sz w:val="20"/>
               </w:rPr>
-              <w:t>AutoPk    Enc: on/off</w:t>
+              <w:t>AutoPk    Enc:Off/</w:t>
+            </w:r>
+          </w:p>
+          <w:p>
+            <w:pPr>
+              <w:spacing w:after="0" w:before="0"/>
+            </w:pPr>
+            <w:r>
+              <w:rPr>
+                <w:rFonts w:ascii="Arial" w:hAnsi="Arial"/>
+                <w:sz w:val="20"/>
+              </w:rPr>
+              <w:t xml:space="preserve">  Full/Bin</w:t>
             </w:r>
           </w:p>
           <w:p>
@@ -1072,7 +1084,7 @@
         <w:rPr>
           <w:sz w:val="12"/>
         </w:rPr>
-        <w:t>Generated 2026-08-26 03:15 AM PDT (Pacific) by tools/gen_cheat_sheet_card.py -- see cheat_sheet_card.txt for full print-prep steps and the Claude Code regeneration prompts.</w:t>
+        <w:t>Generated 2026-08-27 06:40 PM PDT (Pacific) by tools/gen_cheat_sheet_card.py -- see cheat_sheet_card.txt for full print-prep steps and the Claude Code regeneration prompts.</w:t>
       </w:r>
     </w:p>
     <w:sectPr>

</xml_diff>